<commit_message>
Update proposal with final 5-run results
</commit_message>
<xml_diff>
--- a/thesis_proposal.docx
+++ b/thesis_proposal.docx
@@ -243,7 +243,7 @@
         <w:rPr>
           <w:i w:val="0"/>
         </w:rPr>
-        <w:t>Failures (bump, freeze, drift, noise) are added to held-out test recordings at different sizes, so their exact place is known. All methods get the same false-alarm budget (about 5 % of normal recordings). I measure detection quality (ROC-AUC), detection rate, delay and the smallest detectable failure, and repeat every experiment with several random seeds. The most unusual real recordings are checked by eye to test the methods on real behaviour.</w:t>
+        <w:t>Failures (bump, freeze, drift, noise) are added to held-out test recordings at different sizes, so their exact place is known. All methods get the same false-alarm budget (about 5 % of normal recordings). I measure detection quality (ROC-AUC), detection rate, delay and the smallest detectable failure. Every experiment is repeated with 5 random splits of the recordings. The most unusual real recordings are checked on camera.</w:t>
       </w:r>
     </w:p>
     <w:p>
@@ -256,7 +256,7 @@
           <w:color w:val="1F5F8B"/>
           <w:sz w:val="19"/>
         </w:rPr>
-        <w:t>FIRST RESULTS (ALREADY DONE)</w:t>
+        <w:t>FIRST RESULTS (ALREADY DONE, AVERAGE OF 5 RUNS)</w:t>
       </w:r>
     </w:p>
     <w:tbl>
@@ -267,14 +267,15 @@
         <w:tblLook w:firstColumn="1" w:firstRow="1" w:lastColumn="0" w:lastRow="0" w:noHBand="0" w:noVBand="1" w:val="04A0"/>
       </w:tblPr>
       <w:tblGrid>
-        <w:gridCol w:w="3364"/>
-        <w:gridCol w:w="3364"/>
-        <w:gridCol w:w="3364"/>
+        <w:gridCol w:w="2523"/>
+        <w:gridCol w:w="2523"/>
+        <w:gridCol w:w="2523"/>
+        <w:gridCol w:w="2523"/>
       </w:tblGrid>
       <w:tr>
         <w:tc>
           <w:tcPr>
-            <w:tcW w:type="dxa" w:w="4422"/>
+            <w:tcW w:type="dxa" w:w="3969"/>
             <w:shd w:val="clear" w:color="auto" w:fill="E4EEF6"/>
           </w:tcPr>
           <w:p>
@@ -293,7 +294,7 @@
         </w:tc>
         <w:tc>
           <w:tcPr>
-            <w:tcW w:type="dxa" w:w="2041"/>
+            <w:tcW w:type="dxa" w:w="1701"/>
             <w:shd w:val="clear" w:color="auto" w:fill="E4EEF6"/>
           </w:tcPr>
           <w:p>
@@ -306,13 +307,13 @@
                 <w:b/>
                 <w:sz w:val="18"/>
               </w:rPr>
-              <w:t>Best simple rule</w:t>
+              <w:t>Rule: keeps its speed</w:t>
             </w:r>
           </w:p>
         </w:tc>
         <w:tc>
           <w:tcPr>
-            <w:tcW w:type="dxa" w:w="3628"/>
+            <w:tcW w:type="dxa" w:w="1474"/>
             <w:shd w:val="clear" w:color="auto" w:fill="E4EEF6"/>
           </w:tcPr>
           <w:p>
@@ -325,7 +326,26 @@
                 <w:b/>
                 <w:sz w:val="18"/>
               </w:rPr>
-              <w:t>Learned models (GRU, Transformer)</w:t>
+              <w:t>GRU</w:t>
+            </w:r>
+          </w:p>
+        </w:tc>
+        <w:tc>
+          <w:tcPr>
+            <w:tcW w:type="dxa" w:w="2948"/>
+            <w:shd w:val="clear" w:color="auto" w:fill="E4EEF6"/>
+          </w:tcPr>
+          <w:p>
+            <w:pPr>
+              <w:spacing w:after="0"/>
+            </w:pPr>
+            <w:r/>
+            <w:r>
+              <w:rPr>
+                <w:b/>
+                <w:sz w:val="18"/>
+              </w:rPr>
+              <w:t>Uncertainty-aware GRU (new)</w:t>
             </w:r>
           </w:p>
         </w:tc>
@@ -333,7 +353,7 @@
       <w:tr>
         <w:tc>
           <w:tcPr>
-            <w:tcW w:type="dxa" w:w="4422"/>
+            <w:tcW w:type="dxa" w:w="3969"/>
           </w:tcPr>
           <w:p>
             <w:pPr>
@@ -350,7 +370,7 @@
         </w:tc>
         <w:tc>
           <w:tcPr>
-            <w:tcW w:type="dxa" w:w="2041"/>
+            <w:tcW w:type="dxa" w:w="1701"/>
           </w:tcPr>
           <w:p>
             <w:pPr>
@@ -361,13 +381,13 @@
               <w:rPr>
                 <w:sz w:val="18"/>
               </w:rPr>
-              <w:t>62 mm</w:t>
+              <w:t>59 mm</w:t>
             </w:r>
           </w:p>
         </w:tc>
         <w:tc>
           <w:tcPr>
-            <w:tcW w:type="dxa" w:w="3628"/>
+            <w:tcW w:type="dxa" w:w="1474"/>
           </w:tcPr>
           <w:p>
             <w:pPr>
@@ -378,7 +398,24 @@
               <w:rPr>
                 <w:sz w:val="18"/>
               </w:rPr>
-              <w:t>16–18 mm</w:t>
+              <w:t>16 mm</w:t>
+            </w:r>
+          </w:p>
+        </w:tc>
+        <w:tc>
+          <w:tcPr>
+            <w:tcW w:type="dxa" w:w="2948"/>
+          </w:tcPr>
+          <w:p>
+            <w:pPr>
+              <w:spacing w:after="0"/>
+            </w:pPr>
+            <w:r/>
+            <w:r>
+              <w:rPr>
+                <w:sz w:val="18"/>
+              </w:rPr>
+              <w:t>18 mm</w:t>
             </w:r>
           </w:p>
         </w:tc>
@@ -386,7 +423,7 @@
       <w:tr>
         <w:tc>
           <w:tcPr>
-            <w:tcW w:type="dxa" w:w="4422"/>
+            <w:tcW w:type="dxa" w:w="3969"/>
           </w:tcPr>
           <w:p>
             <w:pPr>
@@ -403,7 +440,7 @@
         </w:tc>
         <w:tc>
           <w:tcPr>
-            <w:tcW w:type="dxa" w:w="2041"/>
+            <w:tcW w:type="dxa" w:w="1701"/>
           </w:tcPr>
           <w:p>
             <w:pPr>
@@ -420,7 +457,7 @@
         </w:tc>
         <w:tc>
           <w:tcPr>
-            <w:tcW w:type="dxa" w:w="3628"/>
+            <w:tcW w:type="dxa" w:w="1474"/>
           </w:tcPr>
           <w:p>
             <w:pPr>
@@ -431,7 +468,24 @@
               <w:rPr>
                 <w:sz w:val="18"/>
               </w:rPr>
-              <w:t>0.74–0.80</w:t>
+              <w:t>0.81</w:t>
+            </w:r>
+          </w:p>
+        </w:tc>
+        <w:tc>
+          <w:tcPr>
+            <w:tcW w:type="dxa" w:w="2948"/>
+          </w:tcPr>
+          <w:p>
+            <w:pPr>
+              <w:spacing w:after="0"/>
+            </w:pPr>
+            <w:r/>
+            <w:r>
+              <w:rPr>
+                <w:sz w:val="18"/>
+              </w:rPr>
+              <w:t>0.78</w:t>
             </w:r>
           </w:p>
         </w:tc>
@@ -439,7 +493,7 @@
       <w:tr>
         <w:tc>
           <w:tcPr>
-            <w:tcW w:type="dxa" w:w="4422"/>
+            <w:tcW w:type="dxa" w:w="3969"/>
           </w:tcPr>
           <w:p>
             <w:pPr>
@@ -456,7 +510,7 @@
         </w:tc>
         <w:tc>
           <w:tcPr>
-            <w:tcW w:type="dxa" w:w="2041"/>
+            <w:tcW w:type="dxa" w:w="1701"/>
           </w:tcPr>
           <w:p>
             <w:pPr>
@@ -467,13 +521,13 @@
               <w:rPr>
                 <w:sz w:val="18"/>
               </w:rPr>
-              <w:t>0.46</w:t>
+              <w:t>0.47</w:t>
             </w:r>
           </w:p>
         </w:tc>
         <w:tc>
           <w:tcPr>
-            <w:tcW w:type="dxa" w:w="3628"/>
+            <w:tcW w:type="dxa" w:w="1474"/>
           </w:tcPr>
           <w:p>
             <w:pPr>
@@ -484,7 +538,24 @@
               <w:rPr>
                 <w:sz w:val="18"/>
               </w:rPr>
-              <w:t>0.78–0.80</w:t>
+              <w:t>0.81</w:t>
+            </w:r>
+          </w:p>
+        </w:tc>
+        <w:tc>
+          <w:tcPr>
+            <w:tcW w:type="dxa" w:w="2948"/>
+          </w:tcPr>
+          <w:p>
+            <w:pPr>
+              <w:spacing w:after="0"/>
+            </w:pPr>
+            <w:r/>
+            <w:r>
+              <w:rPr>
+                <w:sz w:val="18"/>
+              </w:rPr>
+              <w:t>0.89</w:t>
             </w:r>
           </w:p>
         </w:tc>
@@ -492,7 +563,7 @@
       <w:tr>
         <w:tc>
           <w:tcPr>
-            <w:tcW w:type="dxa" w:w="4422"/>
+            <w:tcW w:type="dxa" w:w="3969"/>
           </w:tcPr>
           <w:p>
             <w:pPr>
@@ -509,7 +580,7 @@
         </w:tc>
         <w:tc>
           <w:tcPr>
-            <w:tcW w:type="dxa" w:w="2041"/>
+            <w:tcW w:type="dxa" w:w="1701"/>
           </w:tcPr>
           <w:p>
             <w:pPr>
@@ -526,7 +597,7 @@
         </w:tc>
         <w:tc>
           <w:tcPr>
-            <w:tcW w:type="dxa" w:w="3628"/>
+            <w:tcW w:type="dxa" w:w="1474"/>
           </w:tcPr>
           <w:p>
             <w:pPr>
@@ -537,7 +608,164 @@
               <w:rPr>
                 <w:sz w:val="18"/>
               </w:rPr>
-              <w:t>0.97–0.98</w:t>
+              <w:t>0.97</w:t>
+            </w:r>
+          </w:p>
+        </w:tc>
+        <w:tc>
+          <w:tcPr>
+            <w:tcW w:type="dxa" w:w="2948"/>
+          </w:tcPr>
+          <w:p>
+            <w:pPr>
+              <w:spacing w:after="0"/>
+            </w:pPr>
+            <w:r/>
+            <w:r>
+              <w:rPr>
+                <w:sz w:val="18"/>
+              </w:rPr>
+              <w:t>0.98</w:t>
+            </w:r>
+          </w:p>
+        </w:tc>
+      </w:tr>
+      <w:tr>
+        <w:tc>
+          <w:tcPr>
+            <w:tcW w:type="dxa" w:w="3969"/>
+          </w:tcPr>
+          <w:p>
+            <w:pPr>
+              <w:spacing w:after="0"/>
+            </w:pPr>
+            <w:r/>
+            <w:r>
+              <w:rPr>
+                <w:sz w:val="18"/>
+              </w:rPr>
+              <w:t>Half-size failures caught</w:t>
+            </w:r>
+          </w:p>
+        </w:tc>
+        <w:tc>
+          <w:tcPr>
+            <w:tcW w:type="dxa" w:w="1701"/>
+          </w:tcPr>
+          <w:p>
+            <w:pPr>
+              <w:spacing w:after="0"/>
+            </w:pPr>
+            <w:r/>
+            <w:r>
+              <w:rPr>
+                <w:sz w:val="18"/>
+              </w:rPr>
+              <w:t>86 %</w:t>
+            </w:r>
+          </w:p>
+        </w:tc>
+        <w:tc>
+          <w:tcPr>
+            <w:tcW w:type="dxa" w:w="1474"/>
+          </w:tcPr>
+          <w:p>
+            <w:pPr>
+              <w:spacing w:after="0"/>
+            </w:pPr>
+            <w:r/>
+            <w:r>
+              <w:rPr>
+                <w:sz w:val="18"/>
+              </w:rPr>
+              <w:t>58 %</w:t>
+            </w:r>
+          </w:p>
+        </w:tc>
+        <w:tc>
+          <w:tcPr>
+            <w:tcW w:type="dxa" w:w="2948"/>
+          </w:tcPr>
+          <w:p>
+            <w:pPr>
+              <w:spacing w:after="0"/>
+            </w:pPr>
+            <w:r/>
+            <w:r>
+              <w:rPr>
+                <w:sz w:val="18"/>
+              </w:rPr>
+              <w:t>91 %</w:t>
+            </w:r>
+          </w:p>
+        </w:tc>
+      </w:tr>
+      <w:tr>
+        <w:tc>
+          <w:tcPr>
+            <w:tcW w:type="dxa" w:w="3969"/>
+          </w:tcPr>
+          <w:p>
+            <w:pPr>
+              <w:spacing w:after="0"/>
+            </w:pPr>
+            <w:r/>
+            <w:r>
+              <w:rPr>
+                <w:sz w:val="18"/>
+              </w:rPr>
+              <w:t>False alarms when 90 % of failures are caught</w:t>
+            </w:r>
+          </w:p>
+        </w:tc>
+        <w:tc>
+          <w:tcPr>
+            <w:tcW w:type="dxa" w:w="1701"/>
+          </w:tcPr>
+          <w:p>
+            <w:pPr>
+              <w:spacing w:after="0"/>
+            </w:pPr>
+            <w:r/>
+            <w:r>
+              <w:rPr>
+                <w:sz w:val="18"/>
+              </w:rPr>
+              <w:t>0.49</w:t>
+            </w:r>
+          </w:p>
+        </w:tc>
+        <w:tc>
+          <w:tcPr>
+            <w:tcW w:type="dxa" w:w="1474"/>
+          </w:tcPr>
+          <w:p>
+            <w:pPr>
+              <w:spacing w:after="0"/>
+            </w:pPr>
+            <w:r/>
+            <w:r>
+              <w:rPr>
+                <w:sz w:val="18"/>
+              </w:rPr>
+              <w:t>0.21</w:t>
+            </w:r>
+          </w:p>
+        </w:tc>
+        <w:tc>
+          <w:tcPr>
+            <w:tcW w:type="dxa" w:w="2948"/>
+          </w:tcPr>
+          <w:p>
+            <w:pPr>
+              <w:spacing w:after="0"/>
+            </w:pPr>
+            <w:r/>
+            <w:r>
+              <w:rPr>
+                <w:sz w:val="18"/>
+              </w:rPr>
+              <w:t>0.22</w:t>
             </w:r>
           </w:p>
         </w:tc>
@@ -550,7 +778,7 @@
           <w:color w:val="56616D"/>
           <w:sz w:val="18"/>
         </w:rPr>
-        <w:t>Fast failures are easy even for simple rules; slow failures need a learned model. Isolation Forest (0.52) and the LSTM autoencoder (0.75, average ROC-AUC) are clearly weaker. One real recording (no. 293) was flagged as highly unusual and will be inspected.</w:t>
+        <w:t>Fast failures are easy even for simple rules; slow failures need a learned model. Isolation Forest (0.53) and the LSTM autoencoder (0.77, average ROC-AUC) are clearly weaker. First answer to RQ3: the uncertainty-aware GRU detects better in all 5 runs, but it does not reduce false alarms. The top real unusual recordings are not failures; their alarms come from a near-constant wrist joint and from fast starts.</w:t>
       </w:r>
     </w:p>
     <w:p>
@@ -644,7 +872,7 @@
               <w:rPr>
                 <w:sz w:val="18"/>
               </w:rPr>
-              <w:t>Uncertainty-aware model (RQ3)</w:t>
+              <w:t>RQ3: why the new model detects better</w:t>
             </w:r>
           </w:p>
         </w:tc>
@@ -714,7 +942,7 @@
               <w:rPr>
                 <w:sz w:val="18"/>
               </w:rPr>
-              <w:t>Real recordings; repeated runs</w:t>
+              <w:t>Fixes found on real data; final runs</w:t>
             </w:r>
           </w:p>
         </w:tc>
@@ -854,7 +1082,7 @@
         <w:t xml:space="preserve">Risk: </w:t>
       </w:r>
       <w:r>
-        <w:t>RQ3 may not reduce false alarms. The result is still reported, with an analysis of why.</w:t>
+        <w:t>the new model's advantage may come from better scaling, not from uncertainty. Mitigation: an ablation study that separates the two.</w:t>
       </w:r>
     </w:p>
     <w:p>
@@ -875,7 +1103,7 @@
         <w:rPr>
           <w:i w:val="0"/>
         </w:rPr>
-        <w:t>A tested way to detect robot failures without failure labels, a fair comparison of seven methods on real UR5e data, evidence on whether uncertainty-aware prediction reduces false alarms, and practical notes on two data traps that make results look better than they are. Code and results: github.com/Nahidzeinali-web/Test</w:t>
+        <w:t>A tested way to detect robot failures without failure labels, a fair comparison of seven methods on real UR5e data, evidence on what uncertainty-aware prediction does and does not improve, and practical notes on two data traps that make results look better than they are. Code and results: github.com/Nahidzeinali-web/Test</w:t>
       </w:r>
     </w:p>
     <w:sectPr>

</xml_diff>